<commit_message>
docs(paper): clarify training scope and SEC scoring
</commit_message>
<xml_diff>
--- a/paper/paper.docx
+++ b/paper/paper.docx
@@ -406,7 +406,7 @@
           <w:rFonts w:ascii="Times New Roman" w:hAnsi="Times New Roman" w:eastAsia="Times New Roman"/>
           <w:sz w:val="26"/>
         </w:rPr>
-        <w:t xml:space="preserve">This study asks whether news sentiment and narratives add information about returns, realized volatility, and trading volume for five cryptocurrencies beyond lagged market variables. English-language news is matched to Binance candles from January 2023 to September 2026. Each article is assigned a verified public timestamp, and text models are fitted only on the training period. We compare financial dictionaries with FinBERT, estimate predictive and quantile regressions, examine hourly publication events, and evaluate Elastic Net, XGBoost, and LightGBM out of sample. The current real-data snapshot contains news on 339 of 1,369 calendar days; the Bitcoin core specification uses 229 training, 47 validation, and 59 test days. The four-hour price-response difference between negative and positive news is not significant after multiple-testing adjustment, whereas positive news is associated with a larger abnormal volume response. Among 39 article–asset pairs with two timestamps, the choice of clock changes the significance status of the 24-hour response, although the paired difference is not significant. Text slightly lowers Bitcoin volatility forecast error, but the continuous test segment is too short for a reliable incremental-value test. The findings emphasize publication-time discipline and cautious interpretation under sparse news coverage.</w:t>
+        <w:t xml:space="preserve">This study asks whether news sentiment and narratives add information about returns, realized volatility, and trading volume for five cryptocurrencies beyond lagged market variables. English-language news is matched to Binance candles from January 2023 to September 2026. Each article is assigned a verified public timestamp, while corpus-dependent text models and thresholds are fitted only on the training period. We compare financial dictionaries with FinBERT, estimate predictive and quantile regressions, examine hourly publication events, and evaluate Elastic Net, XGBoost, and LightGBM out of sample. The current real-data snapshot contains news on 339 of 1,369 calendar days; the Bitcoin core specification uses 229 training, 47 validation, and 59 test days. The four-hour price-response difference between negative and positive news is not significant after multiple-testing adjustment, whereas positive news is associated with a larger abnormal volume response. Among 39 article–asset pairs with two timestamps, the choice of clock changes the significance status of the 24-hour response, although the paired difference is not significant. Text slightly lowers Bitcoin volatility forecast error, but the continuous test segment is too short for a reliable incremental-value test. The findings emphasize publication-time discipline and cautious interpretation under sparse news coverage.</w:t>
       </w:r>
     </w:p>
     <w:p>
@@ -2498,7 +2498,7 @@
           <w:rFonts w:ascii="Times New Roman" w:hAnsi="Times New Roman" w:eastAsia="Times New Roman"/>
           <w:sz w:val="20"/>
         </w:rPr>
-        <w:t xml:space="preserve">Ghi chú. Mỗi cặp tin–tài sản có trọng số như nhau; khác với trung bình cụm ngày ở phần kết quả. FinBERT không có ở mọi tin SEC. </w:t>
+        <w:t xml:space="preserve">Ghi chú. Mỗi cặp tin–tài sản có trọng số như nhau; khác với trung bình cụm ngày ở phần kết quả. Tin SEC không tham gia nhánh FinBERT chính. </w:t>
       </w:r>
       <w:r>
         <w:rPr>

</xml_diff>

<commit_message>
docs(paper): refine academic prose and evidence limits
</commit_message>
<xml_diff>
--- a/paper/paper.docx
+++ b/paper/paper.docx
@@ -443,7 +443,7 @@
           <w:rFonts w:ascii="Times New Roman" w:hAnsi="Times New Roman" w:eastAsia="Times New Roman"/>
           <w:sz w:val="26"/>
         </w:rPr>
-        <w:t xml:space="preserve">Lợi suất quá khứ, biến động và sự chú ý của nhà đầu tư cũng chứa thông tin dự báo đối với tiền mã hóa (Liu &amp; Tsyvinski, 2021). Các nghiên cứu về Twitter cho thấy ở một số tài sản giá còn dẫn trước hoạt động thảo luận (Kraaijeveld &amp; De Smedt, 2020). Từ góc độ tin tức, Chou và cộng sự (2023) và Kao và cộng sự (2024) nêu bằng chứng định tính trong phần tóm tắt về cơ chế khác nhau giữa tin tiêu cực và tích cực; Gür và Ünal (2026) nêu khả năng sử dụng FinBERT trong dự báo giá Bitcoin. Ba công trình sau chỉ được viện dẫn trong phạm vi thông tin ở tóm tắt, không dùng hệ số chưa đối chiếu từ toàn văn.</w:t>
+        <w:t xml:space="preserve">Lợi suất quá khứ, biến động và sự chú ý của nhà đầu tư cũng chứa thông tin dự báo đối với tiền mã hóa (Liu &amp; Tsyvinski, 2021). Các nghiên cứu về Twitter cho thấy ở một số tài sản giá còn dẫn trước hoạt động thảo luận (Kraaijeveld &amp; De Smedt, 2020). Từ góc độ tin tức, Chou và cộng sự (2023) và Kao và cộng sự (2024) nêu bằng chứng định tính trong phần tóm tắt về cơ chế khác nhau giữa tin tiêu cực và tích cực; Gür và Ünal (2026) nêu khả năng sử dụng FinBERT trong dự báo giá Bitcoin. Ba nghiên cứu này chỉ được viện dẫn trong phạm vi thông tin ở tóm tắt, không dùng hệ số chưa đối chiếu từ toàn văn.</w:t>
       </w:r>
     </w:p>
     <w:p>
@@ -467,7 +467,7 @@
           <w:rFonts w:ascii="Times New Roman" w:hAnsi="Times New Roman" w:eastAsia="Times New Roman"/>
           <w:sz w:val="26"/>
         </w:rPr>
-        <w:t xml:space="preserve">Nghiên cứu này trả lời 05 câu hỏi. RQ1 so sánh FinBERT với từ điển tài chính trong đo cảm xúc tin tiền mã hóa. RQ2 kiểm tra bất đối xứng giữa tin xấu và tin tốt. RQ3 tìm quan hệ giữa sự chú ý tới từng narrative với lợi suất, biến động và khối lượng. RQ4 xem tín hiệu tin dẫn thị trường hay chỉ phản ứng với giá. RQ5 kiểm tra liệu thêm văn bản cải thiện dự báo ngoài mẫu so với mô hình chỉ có biến thị trường. Nghiên cứu đóng góp vào tài liệu học thuật hiện có bằng việc giữ nguyên văn bản tiếng Anh, kiểm tra nhiều đồng hồ thời gian, khóa kỳ kiểm tra khỏi mọi bước chọn mô hình, đối chiếu cả kết quả theo ngày lẫn phản ứng theo giờ và công bố rõ các phép kiểm định chưa đủ điều kiện thực hiện.</w:t>
+        <w:t xml:space="preserve">Nghiên cứu này trả lời 05 câu hỏi. RQ1 so sánh FinBERT với từ điển tài chính trong đo cảm xúc tin tiền mã hóa. RQ2 kiểm tra bất đối xứng giữa tin xấu và tin tốt. RQ3 tìm quan hệ giữa sự chú ý tới từng narrative với lợi suất, biến động và khối lượng. RQ4 xem tín hiệu tin dẫn thị trường hay chỉ phản ứng với giá. RQ5 kiểm tra liệu thêm văn bản cải thiện dự báo ngoài mẫu so với mô hình chỉ có biến thị trường. Nghiên cứu này mở rộng các nghiên cứu trước bằng cách giữ nguyên văn bản tiếng Anh, kiểm tra nhiều đồng hồ thời gian, khóa kỳ kiểm tra khỏi mọi bước chọn mô hình, đối chiếu cả kết quả theo ngày lẫn phản ứng theo giờ và công bố rõ các phép kiểm định chưa đủ điều kiện thực hiện.</w:t>
       </w:r>
     </w:p>
     <w:p>
@@ -516,7 +516,7 @@
           <w:rFonts w:ascii="Times New Roman" w:hAnsi="Times New Roman" w:eastAsia="Times New Roman"/>
           <w:sz w:val="26"/>
         </w:rPr>
-        <w:t xml:space="preserve">Lý thuyết kinh tế học narrative của Shiller (2017) gợi ý rằng một thông tin về quỹ ETF, quy định hoặc vụ tấn công có thể đổi kỳ vọng khi được đặt trong một câu chuyện có khả năng lan truyền. Da và cộng sự (2011) cho thấy sự chú ý cũng là biến kinh tế cần tách khỏi sắc thái tin. Bybee và cộng sự (2024) cho thấy tỷ trọng chủ đề trong tin kinh doanh có thể đo sự chú ý ở cấp tổng hợp. Khaksar và cộng sự (2026) đo cảm xúc, bất đồng và mức chú ý theo chủ đề trên diễn đàn Bitcoin; nghiên cứu này dùng tin báo có giờ công bố và đặt các chỉ số ở ngày t trước kết quả ngày t+h. Lucey và cộng sự (2022) xây chỉ số bất định tiền mã hóa từ tin tức, gợi ý cần kiểm soát sự bất định chung khi so sánh sức giải thích của từng narrative. Chuỗi UCRY hồi cứu không có bản công bố theo thời gian thực nên chỉ được dùng như kiểm tra độ vững trong phần dữ liệu có sẵn, không được xem là biến dự báo point-in-time chính.</w:t>
+        <w:t xml:space="preserve">Lý thuyết kinh tế học narrative của Shiller (2017) gợi ý rằng một thông tin về quỹ ETF, quy định hoặc vụ tấn công có thể đổi kỳ vọng khi được đặt trong một câu chuyện có khả năng lan truyền. Da và cộng sự (2011) cho thấy sự chú ý cũng là biến kinh tế cần tách khỏi sắc thái tin. Bybee và cộng sự (2024) cho thấy tỷ trọng chủ đề trong tin kinh doanh có thể đo sự chú ý ở cấp tổng hợp. Khaksar và cộng sự (2026) đo cảm xúc, bất đồng và mức chú ý theo chủ đề trên diễn đàn Bitcoin. Khác với nghiên cứu đó, nghiên cứu hiện tại sử dụng tin báo có giờ công bố và đặt các chỉ số ở ngày t trước kết quả ngày t+h. Lucey và cộng sự (2022) xây chỉ số bất định tiền mã hóa từ tin tức, gợi ý cần kiểm soát sự bất định chung khi so sánh sức giải thích của từng narrative. Chuỗi UCRY hồi cứu không có bản công bố theo thời gian thực nên chỉ được dùng như kiểm tra độ vững trong phần dữ liệu có sẵn, không được xem là biến dự báo point-in-time chính.</w:t>
       </w:r>
     </w:p>
     <w:p>
@@ -552,7 +552,7 @@
           <w:rFonts w:ascii="Times New Roman" w:hAnsi="Times New Roman" w:eastAsia="Times New Roman"/>
           <w:sz w:val="26"/>
         </w:rPr>
-        <w:t xml:space="preserve">Các bằng chứng ngoài mẫu cũng chưa đồng nhất. Garcia và Schweitzer (2015), Ortu và cộng sự (2022) và Critien và cộng sự (2022) kết hợp hoạt động trực tuyến với biến giá trong dự báo hoặc chiến lược giao dịch, nhưng phạm vi nguồn, tài sản và kỳ kiểm tra khác nhau. Auer và Claessens (2018) cho thấy tin quy định cần được tách theo nội dung thay vì gộp toàn bộ thành một nhóm. Nghiên cứu hiện tại đặt câu hỏi gia tăng chặt hơn: liệu mô hình có thêm cảm xúc và narrative vượt mô hình đã chứa lợi suất trễ, biến động, khối lượng, momentum và số tin thô, dưới cùng quy tắc huấn luyện theo thời gian. Việc tách kết quả có ý nghĩa thống kê khỏi giá trị giao dịch sau phí giúp tránh diễn giải một tương quan trong mẫu thành cơ hội đầu tư.</w:t>
+        <w:t xml:space="preserve">Các bằng chứng ngoài mẫu cũng chưa đồng nhất. Garcia và Schweitzer (2015), Ortu và cộng sự (2022) và Critien và cộng sự (2022) kết hợp hoạt động trực tuyến với biến giá trong dự báo hoặc chiến lược giao dịch, nhưng phạm vi nguồn, tài sản và kỳ kiểm tra khác nhau. Auer và Claessens (2018) cho thấy tin quy định cần được tách theo nội dung thay vì gộp toàn bộ thành một nhóm. Nghiên cứu hiện tại kiểm định giá trị thông tin gia tăng bằng thiết kế đối chứng chặt hơn: liệu mô hình có thêm cảm xúc và narrative vượt mô hình đã chứa lợi suất trễ, biến động, khối lượng, momentum và số tin thô, dưới cùng quy tắc huấn luyện theo thời gian. Việc tách kết quả có ý nghĩa thống kê khỏi giá trị giao dịch sau phí giúp tránh diễn giải một tương quan trong mẫu thành cơ hội đầu tư.</w:t>
       </w:r>
     </w:p>
     <w:p>
@@ -752,7 +752,7 @@
           <w:rFonts w:ascii="Times New Roman" w:hAnsi="Times New Roman" w:eastAsia="Times New Roman"/>
           <w:sz w:val="26"/>
         </w:rPr>
-        <w:t xml:space="preserve">RQ2 kiểm tra giả thuyết không về tác động bằng nhau của hai phần cảm xúc bằng Wald và đối chiếu hồi quy phân vị ở τ = 0,1; 0,5; 0,9. Cửa sổ phân vị trượt 500 ngày, bước 20 ngày chỉ được diễn giải khi có đủ quan sát hợp lệ; điểm ước lượng ở đuôi không thay thế kiểm định bất đối xứng giữa hai hệ số.</w:t>
+        <w:t xml:space="preserve">RQ2 kiểm tra giả thuyết không về tác động bằng nhau của hai phần cảm xúc bằng Wald và đối chiếu hồi quy phân vị ở τ = 0,1; 0,5; 0,9. Cửa sổ phân vị trượt gồm 500 ngày lịch, dịch 20 ngày mỗi bước; số ngày thực sự có tin trong từng cửa sổ được tính riêng, vì 500 ngày lịch không tương đương 500 quan sát. Kết quả chỉ được diễn giải khi có đủ quan sát hợp lệ; điểm ước lượng ở đuôi không thay thế kiểm định bất đối xứng giữa hai hệ số.</w:t>
       </w:r>
     </w:p>
     <w:p>
@@ -4536,7 +4536,7 @@
           <w:rFonts w:ascii="Times New Roman" w:hAnsi="Times New Roman" w:eastAsia="Times New Roman"/>
           <w:sz w:val="26"/>
         </w:rPr>
-        <w:t xml:space="preserve">Chưa tìm thấy khác biệt giá có ý nghĩa thống kê giữa hai sắc thái, kể cả ở các phân vị lợi suất Bitcoin. Ngược lại, phản ứng khối lượng của tin xấu thấp hơn tin tốt khoảng 0,030 đơn vị log trong bốn giờ, có ý nghĩa sau Holm và cùng chiều theo Wilcoxon. Điều này có nghĩa là mức giao dịch quanh tin tốt cao hơn trong mẫu ngày ghép cặp, chứ không có nghĩa tin tốt gây ra giao dịch: giờ có tin dày và các sự kiện đồng thời có thể cùng tác động. Dấu này khác với trực giác rằng tin xấu luôn gây phản ứng mạnh hơn, và chưa đủ để bác bỏ cơ chế bất đối xứng nêu trong tóm tắt của Chou và cộng sự (2023) hoặc Gür và Ünal (2026), vì các nghiên cứu dùng thị trường và biến mục tiêu khác. Hình 1 cho thấy CAR của ba nhóm sắc thái thay đổi theo cửa sổ, nhưng chưa cung cấp bằng chứng có ý nghĩa về chênh lệch giá.</w:t>
+        <w:t xml:space="preserve">Chưa tìm thấy khác biệt giá có ý nghĩa thống kê giữa hai sắc thái, kể cả ở các phân vị lợi suất Bitcoin. Ngược lại, phản ứng khối lượng của tin xấu thấp hơn tin tốt khoảng 0,030 đơn vị log trong bốn giờ, có ý nghĩa sau Holm và cùng chiều theo Wilcoxon. Điều này có nghĩa là mức giao dịch quanh tin tốt cao hơn trong mẫu ngày ghép cặp, chứ không có nghĩa tin tốt gây ra giao dịch: giờ có tin dày và các sự kiện đồng thời có thể cùng tác động. Dấu này khác với trực giác rằng tin xấu luôn gây phản ứng mạnh hơn, và chưa đủ để bác bỏ cơ chế bất đối xứng nêu trong tóm tắt của Chou và cộng sự (2023) hoặc Gür và Ünal (2026), vì các nghiên cứu dùng thị trường và biến mục tiêu khác. Ở 30 cửa sổ phân vị trượt 500 ngày lịch của Bitcoin, mỗi cửa sổ chỉ có 121–131 quan sát hợp lệ; vì vậy các hệ số trượt chưa đủ để khẳng định tác động ổn định theo thời gian. Hình 1 cho thấy CAR của ba nhóm sắc thái thay đổi theo cửa sổ, nhưng chưa cung cấp bằng chứng có ý nghĩa về chênh lệch giá.</w:t>
       </w:r>
     </w:p>
     <w:p>
@@ -5193,7 +5193,7 @@
           <w:rFonts w:ascii="Times New Roman" w:hAnsi="Times New Roman" w:eastAsia="Times New Roman"/>
           <w:sz w:val="26"/>
         </w:rPr>
-        <w:t xml:space="preserve">Các dấu phù hợp một số cách diễn giải thông thường, nhưng không nhóm nào có ý nghĩa sau điều chỉnh kiểm định bội. Điều này có nghĩa là chưa thể xếp hạng narrative theo tác động giá; mức 0,045% của nhóm quy định không thể được xem là lợi nhuận có thể khai thác. Kết quả hiện tại chưa xác nhận hay phủ định kết luận của Walker (2024) và Khaksar và cộng sự (2026), vì họ dùng nguồn tin và thước đo narrative khác. Độ vững với attention mềm, loại tin suy đoán giá và trọng số nguồn cũng chưa đủ dữ liệu đồng bộ để kết luận. [[CHỜ_DỮ_LIỆU: bảng robustness_source_weighted_exclude_price]]</w:t>
+        <w:t xml:space="preserve">CAR của nhóm quy định mang dấu dương, còn nhóm an ninh và vụ tấn công mang dấu âm, nhưng không nhóm nào có ý nghĩa sau điều chỉnh kiểm định bội. Điều này có nghĩa là chưa thể xếp hạng narrative theo tác động giá; mức 0,045% của nhóm quy định không thể được xem là lợi nhuận có thể khai thác. Kết quả hiện tại chưa xác nhận hay phủ định kết luận của Walker (2024) và Khaksar và cộng sự (2026), vì họ dùng nguồn tin và thước đo narrative khác. Độ vững với attention mềm, loại tin suy đoán giá và trọng số nguồn cũng chưa đủ dữ liệu đồng bộ để kết luận. [[CHỜ_DỮ_LIỆU: bảng robustness_source_weighted_exclude_price]]</w:t>
       </w:r>
     </w:p>
     <w:p>
@@ -6335,7 +6335,7 @@
           <w:rFonts w:ascii="Times New Roman" w:hAnsi="Times New Roman" w:eastAsia="Times New Roman"/>
           <w:sz w:val="26"/>
         </w:rPr>
-        <w:t xml:space="preserve">Nghiên cứu đặt cảm xúc và narrative tin tức vào cùng một khuôn kiểm tra cho 05 tài sản tiền mã hóa, trong đó thời điểm công bố được xử lý như một phần của phép đo chứ không chỉ là thuộc tính dữ liệu. Trên bản chụp thật hiện có, tin phủ 24,76% ngày lịch. Không có bằng chứng giá sau tin xấu mạnh hơn tin tốt trong bốn giờ hoặc một ngày; khối lượng quanh tin tốt cao hơn trong mẫu ngày ghép cặp. Chưa có narrative nào cho CAR có ý nghĩa sau điều chỉnh kiểm định bội. Việc đổi từ giờ đăng sang giờ hệ thống thấy tin làm đổi trạng thái ý nghĩa ở cửa sổ 24 giờ, nhưng mức chênh hai cách đo chưa có ý nghĩa. Dự báo RV Bitcoin khi thêm văn bản có RMSE thấp hơn rất nhẹ, song RQ5 vẫn chưa có đoạn kiểm định liên tục đủ dài. RQ1 còn cần nhãn kiểm định độc lập; RQ4 còn cần chuỗi tin liền mạch cho VAR/Granger.</w:t>
+        <w:t xml:space="preserve">Nghiên cứu đặt cảm xúc và narrative tin tức vào cùng một khuôn kiểm tra cho 05 tài sản tiền mã hóa, trong đó thời điểm công bố được xử lý như một phần của phép đo chứ không chỉ là thuộc tính dữ liệu. Trên bản chụp thật hiện có, tin phủ 24,76% ngày lịch. Không có bằng chứng giá sau tin xấu mạnh hơn tin tốt trong bốn giờ hoặc một ngày; khối lượng quanh tin tốt cao hơn trong mẫu ngày ghép cặp. Không nhóm câu chuyện thị trường nào có CAR đạt ý nghĩa sau điều chỉnh kiểm định bội. Việc đổi từ giờ đăng sang giờ hệ thống thấy tin làm đổi trạng thái ý nghĩa ở cửa sổ 24 giờ, nhưng mức chênh hai cách đo chưa có ý nghĩa. Dự báo RV Bitcoin khi thêm văn bản có RMSE thấp hơn rất nhẹ, song RQ5 vẫn chưa có đoạn kiểm định liên tục đủ dài. RQ1 còn cần nhãn kiểm định độc lập; RQ4 còn cần chuỗi tin liền mạch cho VAR/Granger.</w:t>
       </w:r>
     </w:p>
     <w:p>

</xml_diff>

<commit_message>
docs(paper): distinguish tagged news from corpus fallback
</commit_message>
<xml_diff>
--- a/paper/paper.docx
+++ b/paper/paper.docx
@@ -577,7 +577,21 @@
           <w:rFonts w:ascii="Times New Roman" w:hAnsi="Times New Roman" w:eastAsia="Times New Roman"/>
           <w:sz w:val="26"/>
         </w:rPr>
-        <w:t xml:space="preserve">Mẫu thiết kế gồm BTC, ETH, SOL, BNB và XRP trong khoảng ngày 01/01/2023 đến 30/09/2026 theo giờ UTC. Giá đóng cửa và khối lượng USD lấy từ nến ngày và nến giờ Binance; lợi suất là sai phân log giá đóng cửa, còn biến động thực hiện (realized volatility, RV) là tổng bình phương lợi suất log theo giờ (Andersen &amp; Bollerslev, 1998). Tin chính là văn bản tiếng Anh từ GDELT GKG, với hồ sơ SEC dùng riêng cho nghiên cứu sự kiện. Chỉ giữ bản canonical sau khử trùng; tin không gắn mã được gán BTC trong phân tích sự kiện, còn chỉ số ngày theo mã chỉ lấy tin gắn mã tương ứng. Mẫu được chia kỳ huấn luyện đến 30/06/2025, xác thực đến 31/12/2025 và kiểm tra từ 01/01/2026; đầu ra ngày t chỉ dùng tin có </w:t>
+        <w:t xml:space="preserve">Mẫu thiết kế gồm BTC, ETH, SOL, BNB và XRP trong khoảng ngày 01/01/2023 đến 30/09/2026 theo giờ UTC. Giá đóng cửa và khối lượng USD lấy từ nến ngày và nến giờ Binance; lợi suất là sai phân log giá đóng cửa, còn biến động thực hiện (realized volatility, RV) là tổng bình phương lợi suất log theo giờ (Andersen &amp; Bollerslev, 1998). Tin chính là văn bản tiếng Anh từ GDELT GKG, với hồ sơ SEC dùng riêng cho nghiên cứu sự kiện. Chỉ giữ bản canonical sau khử trùng; tin không gắn mã được gán BTC trong phân tích sự kiện, còn chỉ số ngày theo mã chỉ lấy tin gắn mã tương ứng. Khi ghép dữ liệu cho mô hình dự báo, ngày không có tin gắn mã nhưng corpus chung có tin dùng chỉ số chung </w:t>
+      </w:r>
+      <w:r>
+        <w:rPr>
+          <w:rFonts w:ascii="Times New Roman" w:hAnsi="Times New Roman" w:eastAsia="Times New Roman"/>
+          <w:sz w:val="26"/>
+        </w:rPr>
+        <w:t xml:space="preserve">ALL</w:t>
+      </w:r>
+      <w:r>
+        <w:rPr>
+          <w:rFonts w:ascii="Times New Roman" w:hAnsi="Times New Roman" w:eastAsia="Times New Roman"/>
+          <w:sz w:val="26"/>
+        </w:rPr>
+        <w:t xml:space="preserve"> làm tín hiệu thay thế; ngày corpus trống vẫn là thiếu dữ liệu. Vì vậy, số ngày dùng cho mô hình có thể lớn hơn số ngày có tin gắn trực tiếp với một tài sản. Mẫu được chia kỳ huấn luyện đến 30/06/2025, xác thực đến 31/12/2025 và kiểm tra từ 01/01/2026; đầu ra ngày t chỉ dùng tin có </w:t>
       </w:r>
       <w:r>
         <w:rPr>
@@ -2538,7 +2552,7 @@
           <w:rFonts w:ascii="Times New Roman" w:hAnsi="Times New Roman" w:eastAsia="Times New Roman"/>
           <w:sz w:val="26"/>
         </w:rPr>
-        <w:t xml:space="preserve">Trước khi diễn giải hệ số, nghiên cứu xem xét phạm vi dữ liệu thật đã có. Bảng 3 trình bày độ phủ văn bản và số ngày dùng được trong đặc tả chính. Đây là mẫu tin đang thu tiếp, không phải toàn bộ tin từng xuất hiện trên thị trường.</w:t>
+        <w:t xml:space="preserve">Trước khi diễn giải hệ số, nghiên cứu xem xét phạm vi dữ liệu thật đã có. Bảng 3 trình bày riêng số ngày có tin gắn từng mã và số ngày dùng được trong đặc tả chính. Đây là mẫu tin đang thu tiếp, không phải toàn bộ tin từng xuất hiện trên thị trường.</w:t>
       </w:r>
     </w:p>
     <w:p>
@@ -2563,7 +2577,7 @@
           <w:rFonts w:ascii="Times New Roman" w:hAnsi="Times New Roman" w:eastAsia="Times New Roman"/>
           <w:sz w:val="26"/>
         </w:rPr>
-        <w:t xml:space="preserve">Độ Phủ Tin Và Số Ngày Hợp Lệ Theo Tài Sản</w:t>
+        <w:t xml:space="preserve">Độ Phủ Tin Gắn Mã Và Số Ngày Hợp Lệ Theo Tài Sản</w:t>
       </w:r>
     </w:p>
     <w:tbl>
@@ -2580,14 +2594,15 @@
         </w:tblBorders>
       </w:tblPr>
       <w:tblGrid>
-        <w:gridCol w:w="1125"/>
-        <w:gridCol w:w="1125"/>
-        <w:gridCol w:w="1125"/>
-        <w:gridCol w:w="1125"/>
-        <w:gridCol w:w="1125"/>
-        <w:gridCol w:w="1125"/>
-        <w:gridCol w:w="1125"/>
-        <w:gridCol w:w="1125"/>
+        <w:gridCol w:w="1000"/>
+        <w:gridCol w:w="1000"/>
+        <w:gridCol w:w="1000"/>
+        <w:gridCol w:w="1000"/>
+        <w:gridCol w:w="1000"/>
+        <w:gridCol w:w="1000"/>
+        <w:gridCol w:w="1000"/>
+        <w:gridCol w:w="1000"/>
+        <w:gridCol w:w="1000"/>
       </w:tblGrid>
       <w:tr>
         <w:trPr>
@@ -2650,7 +2665,7 @@
                 <w:sz w:val="20"/>
                 <w:b/>
               </w:rPr>
-              <w:t xml:space="preserve">Ngày có tin</w:t>
+              <w:t xml:space="preserve">Ngày tin gắn mã</w:t>
             </w:r>
           </w:p>
         </w:tc>
@@ -2670,7 +2685,7 @@
                 <w:sz w:val="20"/>
                 <w:b/>
               </w:rPr>
-              <w:t xml:space="preserve">Tỷ lệ có tin (%)</w:t>
+              <w:t xml:space="preserve">Tỷ lệ tin gắn mã (%)</w:t>
             </w:r>
           </w:p>
         </w:tc>
@@ -2710,7 +2725,7 @@
                 <w:sz w:val="20"/>
                 <w:b/>
               </w:rPr>
-              <w:t xml:space="preserve">Train</w:t>
+              <w:t xml:space="preserve">Dùng ALL</w:t>
             </w:r>
           </w:p>
         </w:tc>
@@ -2730,7 +2745,7 @@
                 <w:sz w:val="20"/>
                 <w:b/>
               </w:rPr>
-              <w:t xml:space="preserve">Valid</w:t>
+              <w:t xml:space="preserve">Train</w:t>
             </w:r>
           </w:p>
         </w:tc>
@@ -2750,6 +2765,26 @@
                 <w:sz w:val="20"/>
                 <w:b/>
               </w:rPr>
+              <w:t xml:space="preserve">Valid</w:t>
+            </w:r>
+          </w:p>
+        </w:tc>
+        <w:tc>
+          <w:tcPr>
+            <w:tcBorders>
+              <w:bottom w:val="single" w:sz="6" w:color="000000"/>
+            </w:tcBorders>
+          </w:tcPr>
+          <w:p>
+            <w:pPr>
+              <w:pStyle w:val="TableText"/>
+            </w:pPr>
+            <w:r>
+              <w:rPr>
+                <w:rFonts w:ascii="Times New Roman" w:hAnsi="Times New Roman" w:eastAsia="Times New Roman"/>
+                <w:sz w:val="20"/>
+                <w:b/>
+              </w:rPr>
               <w:t xml:space="preserve">Test</w:t>
             </w:r>
           </w:p>
@@ -2797,21 +2832,21 @@
                 <w:rFonts w:ascii="Times New Roman" w:hAnsi="Times New Roman" w:eastAsia="Times New Roman"/>
                 <w:sz w:val="20"/>
               </w:rPr>
-              <w:t xml:space="preserve">339</w:t>
-            </w:r>
-          </w:p>
-        </w:tc>
-        <w:tc>
-          <w:p>
-            <w:pPr>
-              <w:pStyle w:val="TableText"/>
-            </w:pPr>
-            <w:r>
-              <w:rPr>
-                <w:rFonts w:ascii="Times New Roman" w:hAnsi="Times New Roman" w:eastAsia="Times New Roman"/>
-                <w:sz w:val="20"/>
-              </w:rPr>
-              <w:t xml:space="preserve">24,76</w:t>
+              <w:t xml:space="preserve">338</w:t>
+            </w:r>
+          </w:p>
+        </w:tc>
+        <w:tc>
+          <w:p>
+            <w:pPr>
+              <w:pStyle w:val="TableText"/>
+            </w:pPr>
+            <w:r>
+              <w:rPr>
+                <w:rFonts w:ascii="Times New Roman" w:hAnsi="Times New Roman" w:eastAsia="Times New Roman"/>
+                <w:sz w:val="20"/>
+              </w:rPr>
+              <w:t xml:space="preserve">24,69</w:t>
             </w:r>
           </w:p>
         </w:tc>
@@ -2826,6 +2861,20 @@
                 <w:sz w:val="20"/>
               </w:rPr>
               <w:t xml:space="preserve">335</w:t>
+            </w:r>
+          </w:p>
+        </w:tc>
+        <w:tc>
+          <w:p>
+            <w:pPr>
+              <w:pStyle w:val="TableText"/>
+            </w:pPr>
+            <w:r>
+              <w:rPr>
+                <w:rFonts w:ascii="Times New Roman" w:hAnsi="Times New Roman" w:eastAsia="Times New Roman"/>
+                <w:sz w:val="20"/>
+              </w:rPr>
+              <w:t xml:space="preserve">1</w:t>
             </w:r>
           </w:p>
         </w:tc>
@@ -2914,21 +2963,21 @@
                 <w:rFonts w:ascii="Times New Roman" w:hAnsi="Times New Roman" w:eastAsia="Times New Roman"/>
                 <w:sz w:val="20"/>
               </w:rPr>
-              <w:t xml:space="preserve">339</w:t>
-            </w:r>
-          </w:p>
-        </w:tc>
-        <w:tc>
-          <w:p>
-            <w:pPr>
-              <w:pStyle w:val="TableText"/>
-            </w:pPr>
-            <w:r>
-              <w:rPr>
-                <w:rFonts w:ascii="Times New Roman" w:hAnsi="Times New Roman" w:eastAsia="Times New Roman"/>
-                <w:sz w:val="20"/>
-              </w:rPr>
-              <w:t xml:space="preserve">24,76</w:t>
+              <w:t xml:space="preserve">327</w:t>
+            </w:r>
+          </w:p>
+        </w:tc>
+        <w:tc>
+          <w:p>
+            <w:pPr>
+              <w:pStyle w:val="TableText"/>
+            </w:pPr>
+            <w:r>
+              <w:rPr>
+                <w:rFonts w:ascii="Times New Roman" w:hAnsi="Times New Roman" w:eastAsia="Times New Roman"/>
+                <w:sz w:val="20"/>
+              </w:rPr>
+              <w:t xml:space="preserve">23,89</w:t>
             </w:r>
           </w:p>
         </w:tc>
@@ -2943,6 +2992,20 @@
                 <w:sz w:val="20"/>
               </w:rPr>
               <w:t xml:space="preserve">317</w:t>
+            </w:r>
+          </w:p>
+        </w:tc>
+        <w:tc>
+          <w:p>
+            <w:pPr>
+              <w:pStyle w:val="TableText"/>
+            </w:pPr>
+            <w:r>
+              <w:rPr>
+                <w:rFonts w:ascii="Times New Roman" w:hAnsi="Times New Roman" w:eastAsia="Times New Roman"/>
+                <w:sz w:val="20"/>
+              </w:rPr>
+              <w:t xml:space="preserve">12</w:t>
             </w:r>
           </w:p>
         </w:tc>
@@ -3031,21 +3094,21 @@
                 <w:rFonts w:ascii="Times New Roman" w:hAnsi="Times New Roman" w:eastAsia="Times New Roman"/>
                 <w:sz w:val="20"/>
               </w:rPr>
-              <w:t xml:space="preserve">339</w:t>
-            </w:r>
-          </w:p>
-        </w:tc>
-        <w:tc>
-          <w:p>
-            <w:pPr>
-              <w:pStyle w:val="TableText"/>
-            </w:pPr>
-            <w:r>
-              <w:rPr>
-                <w:rFonts w:ascii="Times New Roman" w:hAnsi="Times New Roman" w:eastAsia="Times New Roman"/>
-                <w:sz w:val="20"/>
-              </w:rPr>
-              <w:t xml:space="preserve">24,76</w:t>
+              <w:t xml:space="preserve">299</w:t>
+            </w:r>
+          </w:p>
+        </w:tc>
+        <w:tc>
+          <w:p>
+            <w:pPr>
+              <w:pStyle w:val="TableText"/>
+            </w:pPr>
+            <w:r>
+              <w:rPr>
+                <w:rFonts w:ascii="Times New Roman" w:hAnsi="Times New Roman" w:eastAsia="Times New Roman"/>
+                <w:sz w:val="20"/>
+              </w:rPr>
+              <w:t xml:space="preserve">21,84</w:t>
             </w:r>
           </w:p>
         </w:tc>
@@ -3060,6 +3123,20 @@
                 <w:sz w:val="20"/>
               </w:rPr>
               <w:t xml:space="preserve">254</w:t>
+            </w:r>
+          </w:p>
+        </w:tc>
+        <w:tc>
+          <w:p>
+            <w:pPr>
+              <w:pStyle w:val="TableText"/>
+            </w:pPr>
+            <w:r>
+              <w:rPr>
+                <w:rFonts w:ascii="Times New Roman" w:hAnsi="Times New Roman" w:eastAsia="Times New Roman"/>
+                <w:sz w:val="20"/>
+              </w:rPr>
+              <w:t xml:space="preserve">40</w:t>
             </w:r>
           </w:p>
         </w:tc>
@@ -3148,21 +3225,21 @@
                 <w:rFonts w:ascii="Times New Roman" w:hAnsi="Times New Roman" w:eastAsia="Times New Roman"/>
                 <w:sz w:val="20"/>
               </w:rPr>
-              <w:t xml:space="preserve">339</w:t>
-            </w:r>
-          </w:p>
-        </w:tc>
-        <w:tc>
-          <w:p>
-            <w:pPr>
-              <w:pStyle w:val="TableText"/>
-            </w:pPr>
-            <w:r>
-              <w:rPr>
-                <w:rFonts w:ascii="Times New Roman" w:hAnsi="Times New Roman" w:eastAsia="Times New Roman"/>
-                <w:sz w:val="20"/>
-              </w:rPr>
-              <w:t xml:space="preserve">24,76</w:t>
+              <w:t xml:space="preserve">201</w:t>
+            </w:r>
+          </w:p>
+        </w:tc>
+        <w:tc>
+          <w:p>
+            <w:pPr>
+              <w:pStyle w:val="TableText"/>
+            </w:pPr>
+            <w:r>
+              <w:rPr>
+                <w:rFonts w:ascii="Times New Roman" w:hAnsi="Times New Roman" w:eastAsia="Times New Roman"/>
+                <w:sz w:val="20"/>
+              </w:rPr>
+              <w:t xml:space="preserve">14,68</w:t>
             </w:r>
           </w:p>
         </w:tc>
@@ -3177,6 +3254,20 @@
                 <w:sz w:val="20"/>
               </w:rPr>
               <w:t xml:space="preserve">212</w:t>
+            </w:r>
+          </w:p>
+        </w:tc>
+        <w:tc>
+          <w:p>
+            <w:pPr>
+              <w:pStyle w:val="TableText"/>
+            </w:pPr>
+            <w:r>
+              <w:rPr>
+                <w:rFonts w:ascii="Times New Roman" w:hAnsi="Times New Roman" w:eastAsia="Times New Roman"/>
+                <w:sz w:val="20"/>
+              </w:rPr>
+              <w:t xml:space="preserve">138</w:t>
             </w:r>
           </w:p>
         </w:tc>
@@ -3265,21 +3356,21 @@
                 <w:rFonts w:ascii="Times New Roman" w:hAnsi="Times New Roman" w:eastAsia="Times New Roman"/>
                 <w:sz w:val="20"/>
               </w:rPr>
-              <w:t xml:space="preserve">339</w:t>
-            </w:r>
-          </w:p>
-        </w:tc>
-        <w:tc>
-          <w:p>
-            <w:pPr>
-              <w:pStyle w:val="TableText"/>
-            </w:pPr>
-            <w:r>
-              <w:rPr>
-                <w:rFonts w:ascii="Times New Roman" w:hAnsi="Times New Roman" w:eastAsia="Times New Roman"/>
-                <w:sz w:val="20"/>
-              </w:rPr>
-              <w:t xml:space="preserve">24,76</w:t>
+              <w:t xml:space="preserve">315</w:t>
+            </w:r>
+          </w:p>
+        </w:tc>
+        <w:tc>
+          <w:p>
+            <w:pPr>
+              <w:pStyle w:val="TableText"/>
+            </w:pPr>
+            <w:r>
+              <w:rPr>
+                <w:rFonts w:ascii="Times New Roman" w:hAnsi="Times New Roman" w:eastAsia="Times New Roman"/>
+                <w:sz w:val="20"/>
+              </w:rPr>
+              <w:t xml:space="preserve">23,01</w:t>
             </w:r>
           </w:p>
         </w:tc>
@@ -3294,6 +3385,20 @@
                 <w:sz w:val="20"/>
               </w:rPr>
               <w:t xml:space="preserve">286</w:t>
+            </w:r>
+          </w:p>
+        </w:tc>
+        <w:tc>
+          <w:p>
+            <w:pPr>
+              <w:pStyle w:val="TableText"/>
+            </w:pPr>
+            <w:r>
+              <w:rPr>
+                <w:rFonts w:ascii="Times New Roman" w:hAnsi="Times New Roman" w:eastAsia="Times New Roman"/>
+                <w:sz w:val="20"/>
+              </w:rPr>
+              <w:t xml:space="preserve">23</w:t>
             </w:r>
           </w:p>
         </w:tc>
@@ -3350,13 +3455,41 @@
           <w:rFonts w:ascii="Times New Roman" w:hAnsi="Times New Roman" w:eastAsia="Times New Roman"/>
           <w:sz w:val="20"/>
         </w:rPr>
-        <w:t xml:space="preserve">Ghi chú. Độ phủ từ </w:t>
+        <w:t xml:space="preserve">Ghi chú. Độ phủ tin gắn mã từ </w:t>
       </w:r>
       <w:r>
         <w:rPr>
           <w:rFonts w:ascii="Times New Roman" w:hAnsi="Times New Roman" w:eastAsia="Times New Roman"/>
           <w:sz w:val="20"/>
         </w:rPr>
+        <w:t xml:space="preserve">asset_news_days</w:t>
+      </w:r>
+      <w:r>
+        <w:rPr>
+          <w:rFonts w:ascii="Times New Roman" w:hAnsi="Times New Roman" w:eastAsia="Times New Roman"/>
+          <w:sz w:val="20"/>
+        </w:rPr>
+        <w:t xml:space="preserve"> và số ngày dùng corpus chung từ </w:t>
+      </w:r>
+      <w:r>
+        <w:rPr>
+          <w:rFonts w:ascii="Times New Roman" w:hAnsi="Times New Roman" w:eastAsia="Times New Roman"/>
+          <w:sz w:val="20"/>
+        </w:rPr>
+        <w:t xml:space="preserve">fallback_model_days</w:t>
+      </w:r>
+      <w:r>
+        <w:rPr>
+          <w:rFonts w:ascii="Times New Roman" w:hAnsi="Times New Roman" w:eastAsia="Times New Roman"/>
+          <w:sz w:val="20"/>
+        </w:rPr>
+        <w:t xml:space="preserve"> trong </w:t>
+      </w:r>
+      <w:r>
+        <w:rPr>
+          <w:rFonts w:ascii="Times New Roman" w:hAnsi="Times New Roman" w:eastAsia="Times New Roman"/>
+          <w:sz w:val="20"/>
+        </w:rPr>
         <w:t xml:space="preserve">coverage.csv</w:t>
       </w:r>
       <w:r>
@@ -3364,7 +3497,7 @@
           <w:rFonts w:ascii="Times New Roman" w:hAnsi="Times New Roman" w:eastAsia="Times New Roman"/>
           <w:sz w:val="20"/>
         </w:rPr>
-        <w:t xml:space="preserve">, bản chụp 18/10/2026; ngày có tin tính từ 01/01/2023 đến 24/09/2026, mẫu thiết kế kết thúc 30/09/2026. Ngày mô hình còn cần giá và biến trễ hợp lệ. </w:t>
+        <w:t xml:space="preserve">, bản chụp 18/10/2026; toàn corpus có tin trong 339/1.369 ngày lịch (24,76%). Ngày mô hình còn cần giá và biến trễ hợp lệ. Mẫu thiết kế kết thúc 30/09/2026; tin hiện quan sát đến 24/09/2026. </w:t>
       </w:r>
       <w:r>
         <w:rPr>
@@ -3391,7 +3524,7 @@
           <w:rFonts w:ascii="Times New Roman" w:hAnsi="Times New Roman" w:eastAsia="Times New Roman"/>
           <w:sz w:val="26"/>
         </w:rPr>
-        <w:t xml:space="preserve">Điều này có nghĩa là chuỗi giá liên tục không làm cho chuỗi tin liên tục: Bitcoin chỉ có 59 ngày kiểm tra đủ biến, dù khoảng lịch dài hơn. Do đó, kết quả hồi quy và dự báo bên dưới chỉ áp dụng cho ngày được quan sát; không được ngoại suy sang các ngày không thu được tin. Sự thiếu hụt dữ liệu có thể làm yếu kiểm định Granger và làm thay đổi thành phần tin theo thời gian.</w:t>
+        <w:t xml:space="preserve">Điều này có nghĩa là chuỗi giá liên tục không làm cho chuỗi tin liên tục: Bitcoin chỉ có 59 ngày kiểm tra đủ biến, dù khoảng lịch dài hơn. Với BNB, 138 trong 212 ngày mô hình (65,1%) dùng tín hiệu corpus chung; vì vậy không thể diễn giải các ước lượng này như tác động riêng của tin BNB. Tỷ trọng fallback cũng hiện diện ở SOL nhưng thấp hơn, 40 trong 254 ngày. Do đó, kết quả hồi quy và dự báo bên dưới chỉ áp dụng cho ngày được quan sát và cách ghép tin đã nêu; không được ngoại suy sang các ngày không thu được tin. Sự thiếu hụt dữ liệu có thể làm yếu kiểm định Granger và làm thay đổi thành phần tin theo thời gian.</w:t>
       </w:r>
     </w:p>
     <w:p>

</xml_diff>